<commit_message>
Completar la portada de los manuales con los datos del curso
E.E.S.T. N° 5, Proyecto, Diseño e Implementación de Sistemas
Computacionales, docente Martín A. Estanga Schulze, 7° 4° GB.

Co-Authored-By: Claude Opus 5.5 <noreply@anthropic.com>
</commit_message>
<xml_diff>
--- a/docs/manual-instalacion/Manual_de_Instalacion_MacroEntreno.docx
+++ b/docs/manual-instalacion/Manual_de_Instalacion_MacroEntreno.docx
@@ -15,7 +15,7 @@
           <w:sz w:val="22"/>
           <w:szCs w:val="22"/>
         </w:rPr>
-        <w:t xml:space="preserve">[Institución]</w:t>
+        <w:t xml:space="preserve">E.E.S.T. N° 5</w:t>
       </w:r>
     </w:p>
     <w:p>
@@ -73,7 +73,7 @@
           <w:sz w:val="22"/>
           <w:szCs w:val="22"/>
         </w:rPr>
-        <w:t xml:space="preserve">Materia: [Materia]</w:t>
+        <w:t xml:space="preserve">Materia: Proyecto, Diseño e Implementación de Sistemas Computacionales</w:t>
       </w:r>
     </w:p>
     <w:p>
@@ -87,7 +87,7 @@
           <w:sz w:val="22"/>
           <w:szCs w:val="22"/>
         </w:rPr>
-        <w:t xml:space="preserve">Docente: [Docente]</w:t>
+        <w:t xml:space="preserve">Docente: Martín A. Estanga Schulze</w:t>
       </w:r>
     </w:p>
     <w:p>
@@ -101,7 +101,7 @@
           <w:sz w:val="22"/>
           <w:szCs w:val="22"/>
         </w:rPr>
-        <w:t xml:space="preserve">Curso: [Curso]</w:t>
+        <w:t xml:space="preserve">Curso: 7° 4° GB</w:t>
       </w:r>
     </w:p>
     <w:p>

</xml_diff>